<commit_message>
feat: added cover letter functionality
</commit_message>
<xml_diff>
--- a/IsabellaMann_Updated_resume.docx
+++ b/IsabellaMann_Updated_resume.docx
@@ -82,7 +82,7 @@
           <w:sz w:val="20"/>
           <w:szCs w:val="20"/>
         </w:rPr>
-        <w:t xml:space="preserve">Computer Science professional with a Data Science focus and practical experience in SQL query development, including knowledge of T-SQL concepts for writing queries and analyzing data, along with application troubleshooting. Adept at identifying root causes of system behavior, analyzing large datasets, and efficiently processing service requests. Proven ability to collaborate with development, QA, and business teams, with a passion for providing excellent customer service in a fast-paced environment. Possesses strong analytical and problem-solving skills, with foundational knowledge in web development and database management.</w:t>
+        <w:t xml:space="preserve">A results-oriented Computer Science professional with a strong foundation in data analysis, software development, and troubleshooting, adept at utilizing SQL for root cause identification and complex data extraction. Eager to leverage hands-on experience in web development, API engineering, and cross-functional collaboration to support application integrity, manage service requests efficiently, and provide exceptional customer service in a fast-paced DevSupport environment.</w:t>
       </w:r>
     </w:p>
     <w:p>
@@ -223,51 +223,45 @@
           <w:sz w:val="20"/>
           <w:szCs w:val="20"/>
         </w:rPr>
-        <w:t xml:space="preserve">Software Engineer Intern | NASA Langley Research Center, Hampton, VA</w:t>
-        <w:br/>
-        <w:t xml:space="preserve">June 2023–August 2023</w:t>
-        <w:br/>
-        <w:t xml:space="preserve">    • Utilized Python and data visualization tools to interpret complex atmospheric datasets, creating queries on large data sets for root cause identification.</w:t>
-        <w:br/>
-        <w:t xml:space="preserve">    • Migrated legacy atmospheric data to ArcGIS, demonstrating proficiency in data transfer and handling production-like datasets, relevant for importing and exporting data on production databases.</w:t>
-        <w:br/>
-        <w:t xml:space="preserve">    • Co-engineered a Python-based web mapping service, reducing data visualization time for researchers and users and demonstrating practical web development skills.</w:t>
-        <w:br/>
         <w:t xml:space="preserve">Research Software Developer | Sustainable, Healthy, and Resilient Buildings Lab, Corvallis, OR</w:t>
         <w:br/>
         <w:t xml:space="preserve">February 2024-Present</w:t>
         <w:br/>
-        <w:t xml:space="preserve">    • Engineered a centralized, autonomous data-ingestion pipeline by repurposing legacy laboratory hardware, demonstrating ability to reverse engineer existing systems and manage data flow for a network of 50+ sensors.</w:t>
+        <w:t xml:space="preserve">    • Engineered a centralized, autonomous data-ingestion pipeline by repurposing legacy laboratory hardware into a remote-controlled API server, automating real-time telemetry aggregation for a network of 50+ sensors.</w:t>
         <w:br/>
-        <w:t xml:space="preserve">    • Developed and integrated automated data-cleaning protocols using R, transforming high-dimensional raw sensor outputs into analysis-ready datasets and identifying potential data integrity issues (root cause identification).</w:t>
+        <w:t xml:space="preserve">    • Developed and integrated automated data-cleaning protocols using R, transforming high-dimensional raw sensor outputs into analysis-ready datasets and reducing latency between data collection and scientific analysis.</w:t>
         <w:br/>
-        <w:t xml:space="preserve">    • Collaborated with interdisciplinary research teams to define analytical requirements, serving as a liaison between technical data and diverse stakeholders and business needs.</w:t>
+        <w:t xml:space="preserve">    • Led the design of complex, multi-faceted visual analytics to translate high-volume metrics into accessible, statistically valid graphics, bridging the gap between raw data and scientific insights for diverse stakeholders.</w:t>
+        <w:br/>
+        <w:t xml:space="preserve">    • Collaborated with interdisciplinary research teams to define analytical requirements for indoor air quality, aerosol dynamics, and wildfire smoke research, accelerating cross-disciplinary hypothesis generation.</w:t>
         <w:br/>
         <w:t xml:space="preserve">Software Testing Engineer Intern | Trimble, Lake Oswego, OR</w:t>
         <w:br/>
         <w:t xml:space="preserve">June 2025–September 2025</w:t>
         <w:br/>
-        <w:t xml:space="preserve">    • Engineered multiple RESTful API endpoints for efficient data retrieval and operations with MongoDB, demonstrating direct experience with database interaction for data import/export.</w:t>
+        <w:t xml:space="preserve">    • Engineered multiple RESTful API endpoints to facilitate efficient data retrieval and operations with MongoDB, demonstrating foundational database interaction skills.</w:t>
         <w:br/>
-        <w:t xml:space="preserve">    • Developed 200+ automated API and UI tests, directly contributing to troubleshooting application behavior and ensuring product functionality.</w:t>
+        <w:t xml:space="preserve">    • Developed 200+ automated API and UI tests using Playwright, improving test coverage and supporting product functionality through rigorous validation.</w:t>
         <w:br/>
-        <w:t xml:space="preserve">    • Collaborated with engineers in an Agile environment using Jira and GitHub, gaining experience in cross-functional team communication and managing development processes.</w:t>
+        <w:t xml:space="preserve">    • Created and merged over 17 pull requests in GitHub, contributing directly to the main product codebase and collaborating with other interns and engineers to design efficient, scalable testing solutions using Agile methodologies.</w:t>
+        <w:br/>
+        <w:t xml:space="preserve">Software Engineer Intern | NASA Langley Research Center, Hampton, VA</w:t>
+        <w:br/>
+        <w:t xml:space="preserve">June 2023–August 2023</w:t>
+        <w:br/>
+        <w:t xml:space="preserve">    • Engineered novel data visualization tools within the Atmospheric Science Data Center to interpret complex datasets from the TEMPO satellite.</w:t>
+        <w:br/>
+        <w:t xml:space="preserve">    • Migrated legacy atmospheric data to ArcGIS, enabling real-time web rendering and enhancing data accessibility for researchers.</w:t>
+        <w:br/>
+        <w:t xml:space="preserve">    • Co-engineered a Python-based web mapping service integrating Tempo satellite data, significantly reducing data visualization time for researchers and users.</w:t>
         <w:br/>
         <w:t xml:space="preserve">Data Analyst | Alpha Omicron Pi, Alpha Rho Chapter</w:t>
         <w:br/>
         <w:t xml:space="preserve">December 2025–December 2026</w:t>
         <w:br/>
-        <w:t xml:space="preserve">    • Engineered a robust database and utilized SQL to efficiently clean and parse through over 500+ datasets, demonstrating expertise in managing large data volumes and preparing data for analysis.</w:t>
+        <w:t xml:space="preserve">    • Engineered a robust database that efficiently cleaned and parsed through over 500+ datasets using SQL, ensuring precise analysis of primary recruitment data for strategic planning.</w:t>
         <w:br/>
-        <w:t xml:space="preserve">    • Collaborated with a large interdisciplinary team, mirroring the need to work with business teams and provide clear data insights for service requests.</w:t>
-        <w:br/>
-        <w:t xml:space="preserve">Undergraduate Researcher | Oregon State University, Corvallis, OR</w:t>
-        <w:br/>
-        <w:t xml:space="preserve">February 2023–June 2023</w:t>
-        <w:br/>
-        <w:t xml:space="preserve">    • Analyzed datasets from real-world user studies to identify key insights and troubleshoot usability challenges, directly impacting product improvement through root cause identification.</w:t>
-        <w:br/>
-        <w:t xml:space="preserve">    • Engaged directly with visually impaired users, gathering feedback through surveys, which honed customer service and verbal communication skills.</w:t>
+        <w:t xml:space="preserve">    • Collaborated with a large interdisciplinary team of chapter members to facilitate a smooth and data-driven primary recruitment process.</w:t>
       </w:r>
     </w:p>
     <w:p>
@@ -323,21 +317,19 @@
         <w:br/>
         <w:t xml:space="preserve">September 2025–June 2026</w:t>
         <w:br/>
-        <w:t xml:space="preserve">    • Engineered a full-stack WiFi web application with a React/Preact UI/UX to provide an intuitive interface for an audio-haptic wearable device, demonstrating web development and user-centered design principles for application support.</w:t>
+        <w:t xml:space="preserve">    • Collaborated in a multidisciplinary team of Computer Science and Electrical Engineering to create an open-source device that translates sound into tactile vibrations for the deaf and hard of hearing community.</w:t>
         <w:br/>
-        <w:t xml:space="preserve">    • Collaborated in a multidisciplinary team of Computer Science and Electrical Engineering students, showcasing teamwork and cross-functional communication essential for DevSupport roles.</w:t>
+        <w:t xml:space="preserve">    • Engineered a full-stack WiFi web app to provide a user-friendly interface for an audio-haptic wearable device, demonstrating end-to-end web development capabilities.</w:t>
         <w:br/>
-        <w:t xml:space="preserve">Applied Deep Learning | Winter 2026 Academic Project</w:t>
+        <w:t xml:space="preserve">    • Built the front-end UI/UX using React/Preact, creating an intuitive dashboard focusing on human-centered design for users to configure haptic response behaviors and audio analysis settings.</w:t>
         <w:br/>
-        <w:t xml:space="preserve">January 2026–March 2026</w:t>
-        <w:br/>
-        <w:t xml:space="preserve">    • Engineered and implemented various advanced machine learning models including ConvNeXt, VAEs, RNNs, and Transformer-based language models, showcasing robust problem-solving and analytical capabilities applicable to complex system troubleshooting.</w:t>
-        <w:br/>
-        <w:t xml:space="preserve">Machine Learning  Data Mining | Winter 2026 Academic Project</w:t>
+        <w:t xml:space="preserve">Machine Learning  Data Mining | Academic Project</w:t>
         <w:br/>
         <w:t xml:space="preserve">September 2025–December 2026</w:t>
         <w:br/>
-        <w:t xml:space="preserve">    • Developed custom implementations of machine learning algorithms (K-Nearest Neighbors, Naïve Bayes, Decision Trees, Neural Networks) and optimized their performance using statistical learning methods, directly applicable to data analysis and identifying system performance issues.</w:t>
+        <w:t xml:space="preserve">    • Developed custom implementations of machine learning algorithms, including K-Nearest Neighbors, Naïve Bayes, Decision Trees, and Neural Networks, for both regression and multiclass classification tasks.</w:t>
+        <w:br/>
+        <w:t xml:space="preserve">    • Optimized model performance and generalized predictive capabilities using statistical learning methods, cross-validation, and kernel methods, showcasing strong analytical and problem-solving abilities.</w:t>
       </w:r>
     </w:p>
     <w:p>
@@ -389,11 +381,11 @@
           <w:sz w:val="20"/>
           <w:szCs w:val="20"/>
         </w:rPr>
-        <w:t xml:space="preserve">Languages: SQL, Python, JavaScript, R, HTML5, CSS, TypeScript</w:t>
+        <w:t xml:space="preserve">Languages: SQL, Python, JavaScript, R</w:t>
         <w:br/>
-        <w:t xml:space="preserve">Frameworks  Libraries: React, Preact, Pandas, NumPy, Node.js, PyTorch</w:t>
+        <w:t xml:space="preserve">Frameworks  Libraries: React, Pandas, NumPy, Node.js</w:t>
         <w:br/>
-        <w:t xml:space="preserve">Tools  Environments: Git/GitHub, Jira, MongoDB, Postman, Swagger API, Linux, Visual Studio Code, PowerShell</w:t>
+        <w:t xml:space="preserve">Tools  Environments: Git/GitHub, Jira, MongoDB, PowerShell</w:t>
       </w:r>
     </w:p>
     <w:p>

</xml_diff>